<commit_message>
Publish API docs and expand Office2MD examples
</commit_message>
<xml_diff>
--- a/docs/APIDocs/office2md/examples/word-complex/input.docx
+++ b/docs/APIDocs/office2md/examples/word-complex/input.docx
@@ -139,6 +139,130 @@
         <w:pStyle w:val="Heading2"/>
       </w:pPr>
       <w:r>
+        <w:t>判定条件と複数段落の表</w:t>
+      </w:r>
+    </w:p>
+    <w:p>
+      <w:r>
+        <w:t>二つ目の表では、3列の判定、セル内改行、結合した補足行を同時に確認します。</w:t>
+      </w:r>
+    </w:p>
+    <w:tbl>
+      <w:tblPr>
+        <w:tblBorders>
+          <w:top w:val="single"/>
+          <w:bottom w:val="single"/>
+          <w:insideH w:val="single"/>
+          <w:insideV w:val="single"/>
+        </w:tblBorders>
+      </w:tblPr>
+      <w:tblGrid>
+        <w:gridCol w:w="2600"/>
+        <w:gridCol w:w="2600"/>
+        <w:gridCol w:w="3300"/>
+      </w:tblGrid>
+      <w:tr>
+        <w:trPr>
+          <w:tblHeader/>
+        </w:trPr>
+        <w:tc>
+          <w:p>
+            <w:r>
+              <w:t>条件</w:t>
+            </w:r>
+          </w:p>
+        </w:tc>
+        <w:tc>
+          <w:p>
+            <w:r>
+              <w:t>担当</w:t>
+            </w:r>
+          </w:p>
+        </w:tc>
+        <w:tc>
+          <w:p>
+            <w:r>
+              <w:t>判断</w:t>
+            </w:r>
+          </w:p>
+        </w:tc>
+      </w:tr>
+      <w:tr>
+        <w:tc>
+          <w:p>
+            <w:r>
+              <w:t>通常申請</w:t>
+            </w:r>
+          </w:p>
+        </w:tc>
+        <w:tc>
+          <w:p>
+            <w:r>
+              <w:t>受付</w:t>
+            </w:r>
+          </w:p>
+        </w:tc>
+        <w:tc>
+          <w:p>
+            <w:r>
+              <w:t>当日確認</w:t>
+            </w:r>
+          </w:p>
+        </w:tc>
+      </w:tr>
+      <w:tr>
+        <w:tc>
+          <w:p>
+            <w:r>
+              <w:t>添付不足</w:t>
+            </w:r>
+          </w:p>
+        </w:tc>
+        <w:tc>
+          <w:p>
+            <w:r>
+              <w:t>申請者</w:t>
+            </w:r>
+          </w:p>
+        </w:tc>
+        <w:tc>
+          <w:p>
+            <w:r>
+              <w:t>差し戻し</w:t>
+            </w:r>
+          </w:p>
+          <w:p>
+            <w:r>
+              <w:t>再提出後に再判定</w:t>
+            </w:r>
+          </w:p>
+        </w:tc>
+      </w:tr>
+      <w:tr>
+        <w:tc>
+          <w:tcPr>
+            <w:gridSpan w:val="2"/>
+          </w:tcPr>
+          <w:p>
+            <w:r>
+              <w:t>共通の補足：期限は営業日で数えます。</w:t>
+            </w:r>
+          </w:p>
+        </w:tc>
+        <w:tc>
+          <w:p>
+            <w:r>
+              <w:t>要確認</w:t>
+            </w:r>
+          </w:p>
+        </w:tc>
+      </w:tr>
+    </w:tbl>
+    <w:p>
+      <w:pPr>
+        <w:pStyle w:val="Heading2"/>
+      </w:pPr>
+      <w:r>
         <w:t>番号と脚注</w:t>
       </w:r>
     </w:p>
@@ -163,6 +287,12 @@
       <w:r>
         <w:t>参照付きの脚注です。</w:t>
         <w:footnoteReference w:id="1"/>
+      </w:r>
+    </w:p>
+    <w:p>
+      <w:r>
+        <w:t>判定表の例外条件にも補足を付けます。</w:t>
+        <w:footnoteReference w:id="2"/>
       </w:r>
     </w:p>
     <w:p>
@@ -202,6 +332,31 @@
               </w:txbxContent>
             </v:textbox>
           </v:roundrect>
+        </w:pict>
+      </w:r>
+    </w:p>
+    <w:p>
+      <w:r>
+        <w:pict>
+          <v:oval style="width:190pt;height:95pt" fillcolor="#fff0d6" strokecolor="#b1792e">
+            <v:textbox>
+              <w:txbxContent>
+                <w:p>
+                  <w:r>
+                    <w:rPr>
+                      <w:b/>
+                    </w:rPr>
+                    <w:t>追加の確認図形</w:t>
+                  </w:r>
+                </w:p>
+                <w:p>
+                  <w:r>
+                    <w:t>表の例外を人が確認</w:t>
+                  </w:r>
+                </w:p>
+              </w:txbxContent>
+            </v:textbox>
+          </v:oval>
         </w:pict>
       </w:r>
     </w:p>
@@ -261,6 +416,14 @@
       <w:r>
         <w:footnoteRef/>
         <w:t>脚注は本文の参照順に末尾へまとめます。</w:t>
+      </w:r>
+    </w:p>
+  </w:footnote>
+  <w:footnote w:id="2">
+    <w:p>
+      <w:r>
+        <w:footnoteRef/>
+        <w:t>例外条件は再提出された内容を確認してから処理します。</w:t>
       </w:r>
     </w:p>
   </w:footnote>

</xml_diff>